<commit_message>
Make Prekursor table header bold/centered with wider columns; strip stray outline levels
</commit_message>
<xml_diff>
--- a/templates/prekursor.docx
+++ b/templates/prekursor.docx
@@ -454,32 +454,224 @@
         </w:tblBorders>
       </w:tblPr>
       <w:tblGrid>
-        <w:gridCol w:w="500"/>
-        <w:gridCol w:w="1500"/>
-        <w:gridCol w:w="1800"/>
-        <w:gridCol w:w="2200"/>
+        <w:gridCol w:w="300"/>
+        <w:gridCol w:w="750"/>
+        <w:gridCol w:w="700"/>
+        <w:gridCol w:w="950"/>
+        <w:gridCol w:w="400"/>
+        <w:gridCol w:w="1000"/>
         <w:gridCol w:w="900"/>
-        <w:gridCol w:w="1600"/>
-        <w:gridCol w:w="1000"/>
       </w:tblGrid>
       <w:tr>
         <w:tc>
           <w:tcPr>
-            <w:tcW w:w="200" w:type="pct"/>
+            <w:tcW w:w="300" w:type="pct"/>
           </w:tcPr>
           <w:p>
+            <w:pPr>
+              <w:jc w:val="center"/>
+            </w:pPr>
             <w:r>
+              <w:rPr>
+                <w:rFonts w:ascii="Calibri" w:hAnsi="Calibri"/>
+                <w:b/>
+                <w:sz w:val="22"/>
+              </w:rPr>
               <w:t>No</w:t>
             </w:r>
           </w:p>
         </w:tc>
         <w:tc>
           <w:tcPr>
-            <w:tcW w:w="800" w:type="pct"/>
+            <w:tcW w:w="750" w:type="pct"/>
+          </w:tcPr>
+          <w:p>
+            <w:pPr>
+              <w:jc w:val="center"/>
+            </w:pPr>
+            <w:r>
+              <w:rPr>
+                <w:rFonts w:ascii="Calibri" w:hAnsi="Calibri"/>
+                <w:b/>
+                <w:sz w:val="22"/>
+              </w:rPr>
+              <w:t>Nama Obat Mengandung Prekursor</w:t>
+            </w:r>
+          </w:p>
+        </w:tc>
+        <w:tc>
+          <w:tcPr>
+            <w:tcW w:w="700" w:type="pct"/>
+          </w:tcPr>
+          <w:p>
+            <w:pPr>
+              <w:jc w:val="center"/>
+            </w:pPr>
+            <w:r>
+              <w:rPr>
+                <w:rFonts w:ascii="Calibri" w:hAnsi="Calibri"/>
+                <w:b/>
+                <w:sz w:val="22"/>
+              </w:rPr>
+              <w:t>Zat Aktif Prekursor</w:t>
+            </w:r>
+          </w:p>
+        </w:tc>
+        <w:tc>
+          <w:tcPr>
+            <w:tcW w:w="950" w:type="pct"/>
+          </w:tcPr>
+          <w:p>
+            <w:pPr>
+              <w:jc w:val="center"/>
+            </w:pPr>
+            <w:r>
+              <w:rPr>
+                <w:rFonts w:ascii="Calibri" w:hAnsi="Calibri"/>
+                <w:b/>
+                <w:sz w:val="22"/>
+              </w:rPr>
+              <w:t>Bentuk dan Kekuatan Sediaan</w:t>
+            </w:r>
+          </w:p>
+        </w:tc>
+        <w:tc>
+          <w:tcPr>
+            <w:tcW w:w="400" w:type="pct"/>
+          </w:tcPr>
+          <w:p>
+            <w:pPr>
+              <w:jc w:val="center"/>
+            </w:pPr>
+            <w:r>
+              <w:rPr>
+                <w:rFonts w:ascii="Calibri" w:hAnsi="Calibri"/>
+                <w:b/>
+                <w:sz w:val="22"/>
+              </w:rPr>
+              <w:t>Satuan</w:t>
+            </w:r>
+          </w:p>
+        </w:tc>
+        <w:tc>
+          <w:tcPr>
+            <w:tcW w:w="1000" w:type="pct"/>
+          </w:tcPr>
+          <w:p>
+            <w:pPr>
+              <w:jc w:val="center"/>
+            </w:pPr>
+            <w:r>
+              <w:rPr>
+                <w:rFonts w:ascii="Calibri" w:hAnsi="Calibri"/>
+                <w:b/>
+                <w:sz w:val="22"/>
+              </w:rPr>
+              <w:t>Jumlah Dalam Angka dan Huruf</w:t>
+            </w:r>
+          </w:p>
+        </w:tc>
+        <w:tc>
+          <w:tcPr>
+            <w:tcW w:w="900" w:type="pct"/>
+          </w:tcPr>
+          <w:p>
+            <w:pPr>
+              <w:jc w:val="center"/>
+            </w:pPr>
+            <w:r>
+              <w:rPr>
+                <w:rFonts w:ascii="Calibri" w:hAnsi="Calibri"/>
+                <w:b/>
+                <w:sz w:val="22"/>
+              </w:rPr>
+              <w:t>Keterangan</w:t>
+            </w:r>
+          </w:p>
+        </w:tc>
+      </w:tr>
+      <w:tr>
+        <w:tc>
+          <w:tcPr>
+            <w:tcW w:w="300" w:type="pct"/>
           </w:tcPr>
           <w:p>
             <w:r>
-              <w:t>Nama Obat Mengandung Prekursor</w:t>
+              <w:rPr>
+                <w:rFonts w:ascii="Calibri" w:hAnsi="Calibri"/>
+                <w:b w:val="0"/>
+              </w:rPr>
+              <w:t>{#items}{no}</w:t>
+            </w:r>
+          </w:p>
+        </w:tc>
+        <w:tc>
+          <w:tcPr>
+            <w:tcW w:w="750" w:type="pct"/>
+          </w:tcPr>
+          <w:p>
+            <w:r>
+              <w:rPr>
+                <w:rFonts w:ascii="Calibri" w:hAnsi="Calibri"/>
+                <w:b w:val="0"/>
+              </w:rPr>
+              <w:t>{nama_obat}</w:t>
+            </w:r>
+          </w:p>
+        </w:tc>
+        <w:tc>
+          <w:tcPr>
+            <w:tcW w:w="700" w:type="pct"/>
+          </w:tcPr>
+          <w:p>
+            <w:r>
+              <w:rPr>
+                <w:rFonts w:ascii="Calibri" w:hAnsi="Calibri"/>
+                <w:b w:val="0"/>
+              </w:rPr>
+              <w:t>{zat_aktif}</w:t>
+            </w:r>
+          </w:p>
+        </w:tc>
+        <w:tc>
+          <w:tcPr>
+            <w:tcW w:w="950" w:type="pct"/>
+          </w:tcPr>
+          <w:p>
+            <w:r>
+              <w:rPr>
+                <w:rFonts w:ascii="Calibri" w:hAnsi="Calibri"/>
+                <w:b w:val="0"/>
+              </w:rPr>
+              <w:t>{bentuk_kekuatan}</w:t>
+            </w:r>
+          </w:p>
+        </w:tc>
+        <w:tc>
+          <w:tcPr>
+            <w:tcW w:w="400" w:type="pct"/>
+          </w:tcPr>
+          <w:p>
+            <w:r>
+              <w:rPr>
+                <w:rFonts w:ascii="Calibri" w:hAnsi="Calibri"/>
+                <w:b w:val="0"/>
+              </w:rPr>
+              <w:t>{satuan}</w:t>
+            </w:r>
+          </w:p>
+        </w:tc>
+        <w:tc>
+          <w:tcPr>
+            <w:tcW w:w="1000" w:type="pct"/>
+          </w:tcPr>
+          <w:p>
+            <w:r>
+              <w:rPr>
+                <w:rFonts w:ascii="Calibri" w:hAnsi="Calibri"/>
+                <w:b w:val="0"/>
+              </w:rPr>
+              <w:t>{jumlah}</w:t>
             </w:r>
           </w:p>
         </w:tc>
@@ -489,118 +681,10 @@
           </w:tcPr>
           <w:p>
             <w:r>
-              <w:t>Zat Aktif Prekursor</w:t>
-            </w:r>
-          </w:p>
-        </w:tc>
-        <w:tc>
-          <w:tcPr>
-            <w:tcW w:w="1200" w:type="pct"/>
-          </w:tcPr>
-          <w:p>
-            <w:r>
-              <w:t>Bentuk dan Kekuatan Sediaan</w:t>
-            </w:r>
-          </w:p>
-        </w:tc>
-        <w:tc>
-          <w:tcPr>
-            <w:tcW w:w="500" w:type="pct"/>
-          </w:tcPr>
-          <w:p>
-            <w:r>
-              <w:t>Satuan</w:t>
-            </w:r>
-          </w:p>
-        </w:tc>
-        <w:tc>
-          <w:tcPr>
-            <w:tcW w:w="800" w:type="pct"/>
-          </w:tcPr>
-          <w:p>
-            <w:r>
-              <w:t>Jumlah Dalam Angka dan Huruf</w:t>
-            </w:r>
-          </w:p>
-        </w:tc>
-        <w:tc>
-          <w:tcPr>
-            <w:tcW w:w="600" w:type="pct"/>
-          </w:tcPr>
-          <w:p>
-            <w:r>
-              <w:t>Keterangan</w:t>
-            </w:r>
-          </w:p>
-        </w:tc>
-      </w:tr>
-      <w:tr>
-        <w:tc>
-          <w:tcPr>
-            <w:tcW w:w="200" w:type="pct"/>
-          </w:tcPr>
-          <w:p>
-            <w:r>
-              <w:t>{#items}{no}</w:t>
-            </w:r>
-          </w:p>
-        </w:tc>
-        <w:tc>
-          <w:tcPr>
-            <w:tcW w:w="800" w:type="pct"/>
-          </w:tcPr>
-          <w:p>
-            <w:r>
-              <w:t>{nama_obat}</w:t>
-            </w:r>
-          </w:p>
-        </w:tc>
-        <w:tc>
-          <w:tcPr>
-            <w:tcW w:w="900" w:type="pct"/>
-          </w:tcPr>
-          <w:p>
-            <w:r>
-              <w:t>{zat_aktif}</w:t>
-            </w:r>
-          </w:p>
-        </w:tc>
-        <w:tc>
-          <w:tcPr>
-            <w:tcW w:w="1200" w:type="pct"/>
-          </w:tcPr>
-          <w:p>
-            <w:r>
-              <w:t>{bentuk_kekuatan}</w:t>
-            </w:r>
-          </w:p>
-        </w:tc>
-        <w:tc>
-          <w:tcPr>
-            <w:tcW w:w="500" w:type="pct"/>
-          </w:tcPr>
-          <w:p>
-            <w:r>
-              <w:t>{satuan}</w:t>
-            </w:r>
-          </w:p>
-        </w:tc>
-        <w:tc>
-          <w:tcPr>
-            <w:tcW w:w="800" w:type="pct"/>
-          </w:tcPr>
-          <w:p>
-            <w:r>
-              <w:t>{jumlah}</w:t>
-            </w:r>
-          </w:p>
-        </w:tc>
-        <w:tc>
-          <w:tcPr>
-            <w:tcW w:w="600" w:type="pct"/>
-          </w:tcPr>
-          <w:p>
-            <w:r>
+              <w:rPr>
+                <w:rFonts w:ascii="Calibri" w:hAnsi="Calibri"/>
+                <w:b w:val="0"/>
+              </w:rPr>
               <w:t>{keterangan}{/items}</w:t>
             </w:r>
           </w:p>

</xml_diff>